<commit_message>
wrong class name oops
</commit_message>
<xml_diff>
--- a/hw1.docx
+++ b/hw1.docx
@@ -35,7 +35,15 @@
       </w:pPr>
       <w:r>
         <w:rPr/>
-        <w:t>CMPE283-01</w:t>
+        <w:t>CMPE2</w:t>
+      </w:r>
+      <w:r>
+        <w:rPr/>
+        <w:t>72</w:t>
+      </w:r>
+      <w:r>
+        <w:rPr/>
+        <w:t>-01</w:t>
       </w:r>
     </w:p>
     <w:p>
@@ -59,7 +67,7 @@
           <w:rPr>
             <w:rStyle w:val="Hyperlink"/>
           </w:rPr>
-          <w:t>https://github.com/jkibort928/cmpe283-hw1</w:t>
+          <w:t>https://github.com/jkibort928/cmpe272-hw1</w:t>
         </w:r>
       </w:hyperlink>
     </w:p>
@@ -1628,8 +1636,8 @@
       <w:szCs w:val="26"/>
     </w:rPr>
   </w:style>
-  <w:style w:type="character" w:styleId="Bulletsuser">
-    <w:name w:val="Bullets (user)"/>
+  <w:style w:type="character" w:styleId="Bullets">
+    <w:name w:val="Bullets"/>
     <w:qFormat/>
     <w:rPr>
       <w:rFonts w:ascii="OpenSymbol" w:hAnsi="OpenSymbol" w:eastAsia="OpenSymbol" w:cs="OpenSymbol"/>

</xml_diff>